<commit_message>
Add Yahrzeit Wall V3 release notes
Summarize the operator interface, scheduling, automation, controller, installation, documentation, compatibility, and release verification.
</commit_message>
<xml_diff>
--- a/docs/27-6 yahrzeit overview (2026).docx
+++ b/docs/27-6 yahrzeit overview (2026).docx
@@ -1856,12 +1856,12 @@
           <wp:inline distB="0" distT="0" distL="114300" distR="114300">
             <wp:extent cx="4776788" cy="3595030"/>
             <wp:effectExtent b="0" l="0" r="0" t="0"/>
-            <wp:docPr id="8" name="image1.jpg"/>
+            <wp:docPr id="7" name="image3.jpg"/>
             <a:graphic>
               <a:graphicData uri="http://schemas.openxmlformats.org/drawingml/2006/picture">
                 <pic:pic>
                   <pic:nvPicPr>
-                    <pic:cNvPr id="0" name="image1.jpg"/>
+                    <pic:cNvPr id="0" name="image3.jpg"/>
                     <pic:cNvPicPr preferRelativeResize="0"/>
                   </pic:nvPicPr>
                   <pic:blipFill>
@@ -2535,31 +2535,17 @@
         </w:rPr>
       </w:pPr>
       <w:r>
-        <w:rPr>
-          <w:rFonts w:ascii="Times" w:cs="Times" w:eastAsia="Times" w:hAnsi="Times"/>
-          <w:b w:val="0"/>
-          <w:bCs w:val="0"/>
-          <w:i w:val="0"/>
-          <w:iCs w:val="0"/>
-          <w:smallCaps w:val="0"/>
-          <w:strike w:val="0"/>
-          <w:color w:val="000000"/>
-          <w:sz w:val="24"/>
-          <w:szCs w:val="24"/>
-          <w:u w:val="none"/>
-          <w:shd w:fill="auto" w:val="clear"/>
-          <w:vertAlign w:val="baseline"/>
-        </w:rPr>
+        <w:rPr/>
         <w:drawing>
           <wp:inline distB="114300" distT="114300" distL="114300" distR="114300">
-            <wp:extent cx="4291013" cy="2854872"/>
+            <wp:extent cx="5715000" cy="5067300"/>
             <wp:effectExtent b="0" l="0" r="0" t="0"/>
-            <wp:docPr id="6" name="image5.png"/>
+            <wp:docPr id="10" name="image7.png"/>
             <a:graphic>
               <a:graphicData uri="http://schemas.openxmlformats.org/drawingml/2006/picture">
                 <pic:pic>
                   <pic:nvPicPr>
-                    <pic:cNvPr id="0" name="image5.png"/>
+                    <pic:cNvPr id="0" name="image7.png"/>
                     <pic:cNvPicPr preferRelativeResize="0"/>
                   </pic:nvPicPr>
                   <pic:blipFill>
@@ -2572,7 +2558,7 @@
                   <pic:spPr>
                     <a:xfrm>
                       <a:off x="0" y="0"/>
-                      <a:ext cx="4291013" cy="2854872"/>
+                      <a:ext cx="5715000" cy="5067300"/>
                     </a:xfrm>
                     <a:prstGeom prst="rect"/>
                     <a:ln/>
@@ -2712,14 +2698,14 @@
         </w:rPr>
         <w:drawing>
           <wp:inline distB="114300" distT="114300" distL="114300" distR="114300">
-            <wp:extent cx="4376738" cy="3561196"/>
+            <wp:extent cx="5715000" cy="5080000"/>
             <wp:effectExtent b="0" l="0" r="0" t="0"/>
-            <wp:docPr id="4" name="image4.png"/>
+            <wp:docPr id="4" name="image6.png"/>
             <a:graphic>
               <a:graphicData uri="http://schemas.openxmlformats.org/drawingml/2006/picture">
                 <pic:pic>
                   <pic:nvPicPr>
-                    <pic:cNvPr id="0" name="image4.png"/>
+                    <pic:cNvPr id="0" name="image6.png"/>
                     <pic:cNvPicPr preferRelativeResize="0"/>
                   </pic:nvPicPr>
                   <pic:blipFill>
@@ -2732,7 +2718,7 @@
                   <pic:spPr>
                     <a:xfrm>
                       <a:off x="0" y="0"/>
-                      <a:ext cx="4376738" cy="3561196"/>
+                      <a:ext cx="5715000" cy="5080000"/>
                     </a:xfrm>
                     <a:prstGeom prst="rect"/>
                     <a:ln/>
@@ -2801,12 +2787,12 @@
           <wp:inline distB="114300" distT="114300" distL="114300" distR="114300">
             <wp:extent cx="6577013" cy="5601422"/>
             <wp:effectExtent b="0" l="0" r="0" t="0"/>
-            <wp:docPr id="2" name="image8.png"/>
+            <wp:docPr id="1" name="image5.png"/>
             <a:graphic>
               <a:graphicData uri="http://schemas.openxmlformats.org/drawingml/2006/picture">
                 <pic:pic>
                   <pic:nvPicPr>
-                    <pic:cNvPr id="0" name="image8.png"/>
+                    <pic:cNvPr id="0" name="image5.png"/>
                     <pic:cNvPicPr preferRelativeResize="0"/>
                   </pic:nvPicPr>
                   <pic:blipFill>
@@ -3182,12 +3168,12 @@
             <wp:extent cx="2812940" cy="2964019"/>
             <wp:effectExtent b="0" l="0" r="0" t="0"/>
             <wp:wrapSquare wrapText="bothSides" distB="114300" distT="114300" distL="114300" distR="114300"/>
-            <wp:docPr id="9" name="image3.jpg"/>
+            <wp:docPr id="8" name="image1.jpg"/>
             <a:graphic>
               <a:graphicData uri="http://schemas.openxmlformats.org/drawingml/2006/picture">
                 <pic:pic>
                   <pic:nvPicPr>
-                    <pic:cNvPr id="0" name="image3.jpg"/>
+                    <pic:cNvPr id="0" name="image1.jpg"/>
                     <pic:cNvPicPr preferRelativeResize="0"/>
                   </pic:nvPicPr>
                   <pic:blipFill>
@@ -3705,12 +3691,12 @@
             <wp:extent cx="2865480" cy="2192791"/>
             <wp:effectExtent b="0" l="0" r="0" t="0"/>
             <wp:wrapSquare wrapText="bothSides" distB="114300" distT="114300" distL="114300" distR="114300"/>
-            <wp:docPr id="7" name="image10.png"/>
+            <wp:docPr id="3" name="image9.png"/>
             <a:graphic>
               <a:graphicData uri="http://schemas.openxmlformats.org/drawingml/2006/picture">
                 <pic:pic>
                   <pic:nvPicPr>
-                    <pic:cNvPr id="0" name="image10.png"/>
+                    <pic:cNvPr id="0" name="image9.png"/>
                     <pic:cNvPicPr preferRelativeResize="0"/>
                   </pic:nvPicPr>
                   <pic:blipFill>
@@ -4391,7 +4377,7 @@
           <wp:inline distB="0" distT="0" distL="114300" distR="114300">
             <wp:extent cx="4572000" cy="1099820"/>
             <wp:effectExtent b="0" l="0" r="0" t="0"/>
-            <wp:docPr id="10" name="image2.jpg"/>
+            <wp:docPr id="9" name="image2.jpg"/>
             <a:graphic>
               <a:graphicData uri="http://schemas.openxmlformats.org/drawingml/2006/picture">
                 <pic:pic>
@@ -4668,12 +4654,12 @@
           <wp:inline distB="114300" distT="114300" distL="114300" distR="114300">
             <wp:extent cx="5715000" cy="3581400"/>
             <wp:effectExtent b="0" l="0" r="0" t="0"/>
-            <wp:docPr id="5" name="image6.png"/>
+            <wp:docPr id="2" name="image4.png"/>
             <a:graphic>
               <a:graphicData uri="http://schemas.openxmlformats.org/drawingml/2006/picture">
                 <pic:pic>
                   <pic:nvPicPr>
-                    <pic:cNvPr id="0" name="image6.png"/>
+                    <pic:cNvPr id="0" name="image4.png"/>
                     <pic:cNvPicPr preferRelativeResize="0"/>
                   </pic:nvPicPr>
                   <pic:blipFill>
@@ -5306,6 +5292,41 @@
         </w:rPr>
       </w:pPr>
       <w:r>
+        <w:rPr/>
+        <w:drawing>
+          <wp:inline distB="114300" distT="114300" distL="114300" distR="114300">
+            <wp:extent cx="6607314" cy="5869497"/>
+            <wp:effectExtent b="0" l="0" r="0" t="0"/>
+            <wp:docPr id="6" name="image10.png"/>
+            <a:graphic>
+              <a:graphicData uri="http://schemas.openxmlformats.org/drawingml/2006/picture">
+                <pic:pic>
+                  <pic:nvPicPr>
+                    <pic:cNvPr id="0" name="image10.png"/>
+                    <pic:cNvPicPr preferRelativeResize="0"/>
+                  </pic:nvPicPr>
+                  <pic:blipFill>
+                    <a:blip r:embed="rId22"/>
+                    <a:srcRect b="0" l="0" r="0" t="0"/>
+                    <a:stretch>
+                      <a:fillRect/>
+                    </a:stretch>
+                  </pic:blipFill>
+                  <pic:spPr>
+                    <a:xfrm>
+                      <a:off x="0" y="0"/>
+                      <a:ext cx="6607314" cy="5869497"/>
+                    </a:xfrm>
+                    <a:prstGeom prst="rect"/>
+                    <a:ln/>
+                  </pic:spPr>
+                </pic:pic>
+              </a:graphicData>
+            </a:graphic>
+          </wp:inline>
+        </w:drawing>
+      </w:r>
+      <w:r>
         <w:rPr>
           <w:rtl w:val="0"/>
         </w:rPr>
@@ -5330,41 +5351,6 @@
         </w:tabs>
         <w:rPr/>
       </w:pPr>
-      <w:r>
-        <w:rPr/>
-        <w:drawing>
-          <wp:inline distB="114300" distT="114300" distL="114300" distR="114300">
-            <wp:extent cx="6586538" cy="5280208"/>
-            <wp:effectExtent b="0" l="0" r="0" t="0"/>
-            <wp:docPr id="3" name="image9.png"/>
-            <a:graphic>
-              <a:graphicData uri="http://schemas.openxmlformats.org/drawingml/2006/picture">
-                <pic:pic>
-                  <pic:nvPicPr>
-                    <pic:cNvPr id="0" name="image9.png"/>
-                    <pic:cNvPicPr preferRelativeResize="0"/>
-                  </pic:nvPicPr>
-                  <pic:blipFill>
-                    <a:blip r:embed="rId22"/>
-                    <a:srcRect b="0" l="0" r="0" t="0"/>
-                    <a:stretch>
-                      <a:fillRect/>
-                    </a:stretch>
-                  </pic:blipFill>
-                  <pic:spPr>
-                    <a:xfrm>
-                      <a:off x="0" y="0"/>
-                      <a:ext cx="6586538" cy="5280208"/>
-                    </a:xfrm>
-                    <a:prstGeom prst="rect"/>
-                    <a:ln/>
-                  </pic:spPr>
-                </pic:pic>
-              </a:graphicData>
-            </a:graphic>
-          </wp:inline>
-        </w:drawing>
-      </w:r>
       <w:r>
         <w:rPr>
           <w:rtl w:val="0"/>
@@ -5591,31 +5577,17 @@
         <w:rPr/>
       </w:pPr>
       <w:r>
-        <w:rPr>
-          <w:rtl w:val="0"/>
-        </w:rPr>
-      </w:r>
-    </w:p>
-    <w:p>
-      <w:pPr>
-        <w:pStyle w:val="Heading4"/>
-        <w:spacing w:after="240" w:before="240" w:lineRule="auto"/>
-        <w:rPr/>
-      </w:pPr>
-      <w:bookmarkStart w:colFirst="0" w:colLast="0" w:name="_heading=h.bt5mzijb1ye" w:id="5"/>
-      <w:bookmarkEnd w:id="5"/>
-      <w:r>
         <w:rPr/>
         <w:drawing>
           <wp:inline distB="114300" distT="114300" distL="114300" distR="114300">
-            <wp:extent cx="6606206" cy="4624344"/>
+            <wp:extent cx="6629136" cy="5877834"/>
             <wp:effectExtent b="0" l="0" r="0" t="0"/>
-            <wp:docPr id="1" name="image7.png"/>
+            <wp:docPr id="5" name="image8.png"/>
             <a:graphic>
               <a:graphicData uri="http://schemas.openxmlformats.org/drawingml/2006/picture">
                 <pic:pic>
                   <pic:nvPicPr>
-                    <pic:cNvPr id="0" name="image7.png"/>
+                    <pic:cNvPr id="0" name="image8.png"/>
                     <pic:cNvPicPr preferRelativeResize="0"/>
                   </pic:nvPicPr>
                   <pic:blipFill>
@@ -5628,7 +5600,7 @@
                   <pic:spPr>
                     <a:xfrm>
                       <a:off x="0" y="0"/>
-                      <a:ext cx="6606206" cy="4624344"/>
+                      <a:ext cx="6629136" cy="5877834"/>
                     </a:xfrm>
                     <a:prstGeom prst="rect"/>
                     <a:ln/>
@@ -5639,6 +5611,20 @@
           </wp:inline>
         </w:drawing>
       </w:r>
+      <w:r>
+        <w:rPr>
+          <w:rtl w:val="0"/>
+        </w:rPr>
+      </w:r>
+    </w:p>
+    <w:p>
+      <w:pPr>
+        <w:pStyle w:val="Heading4"/>
+        <w:spacing w:after="240" w:before="240" w:lineRule="auto"/>
+        <w:rPr/>
+      </w:pPr>
+      <w:bookmarkStart w:colFirst="0" w:colLast="0" w:name="_heading=h.bt5mzijb1ye" w:id="5"/>
+      <w:bookmarkEnd w:id="5"/>
       <w:r>
         <w:rPr>
           <w:rtl w:val="0"/>

</xml_diff>